<commit_message>
docs: regenerate demo with larger code font
</commit_message>
<xml_diff>
--- a/生成demo/软件著作权申请资料/正式资料/StudioAgent AI视频制片平台软件_操作手册.docx
+++ b/生成demo/软件著作权申请资料/正式资料/StudioAgent AI视频制片平台软件_操作手册.docx
@@ -1495,7 +1495,7 @@
       </w:r>
     </w:p>
     <w:sectPr>
-      <w:headerReference w:type="default" r:id="R6b4c61c0b9734088"/>
+      <w:headerReference w:type="default" r:id="R568f84af2093475e"/>
       <w:pgSz w:w="11906" w:h="16838" w:orient="portrait"/>
       <w:pgMar w:top="1417" w:right="1417" w:bottom="1417" w:left="1417" w:header="510" w:footer="510"/>
       <w:pgNumType w:start="1"/>
@@ -2308,7 +2308,7 @@
 
 <file path=word/theme/theme1.xml><?xml version="1.0" encoding="utf-8"?>
 <a:theme xmlns:a="http://schemas.openxmlformats.org/drawingml/2006/main" name="Office Theme">
-  <a:themeElements>
+  <a:themeElements xmlns:a="http://schemas.openxmlformats.org/drawingml/2006/main">
     <a:clrScheme name="Office">
       <a:dk1>
         <a:sysClr val="windowText" lastClr="000000"/>
@@ -2349,14 +2349,14 @@
     </a:clrScheme>
     <a:fontScheme name="Office">
       <a:majorFont>
-        <a:latin typeface="Calibri Light"/>
-        <a:ea typeface="等线"/>
-        <a:cs typeface=""/>
+        <a:latin typeface="Times New Roman"/>
+        <a:ea typeface="SimSun"/>
+        <a:cs typeface="Times New Roman"/>
       </a:majorFont>
       <a:minorFont>
-        <a:latin typeface="Calibri"/>
-        <a:ea typeface="等线"/>
-        <a:cs typeface=""/>
+        <a:latin typeface="Times New Roman"/>
+        <a:ea typeface="SimSun"/>
+        <a:cs typeface="Times New Roman"/>
       </a:minorFont>
     </a:fontScheme>
     <a:fmtScheme name="Office">

</xml_diff>